<commit_message>
Corregir formato de fecha en planilla de vacaciones
</commit_message>
<xml_diff>
--- a/public/SOLICITUD DE VACACIONES.docx
+++ b/public/SOLICITUD DE VACACIONES.docx
@@ -446,7 +446,7 @@
           </w:tcPr>
           <w:p>
             <w:r>
-              <w:t>{fecha_solicitud}</w:t>
+              <w:t>{d_gen}</w:t>
             </w:r>
           </w:p>
         </w:tc>
@@ -455,13 +455,9 @@
             <w:tcW w:w="641" w:type="dxa"/>
           </w:tcPr>
           <w:p>
-            <w:pPr>
-              <w:pStyle w:val="TableParagraph"/>
-              <w:rPr>
-                <w:rFonts w:ascii="Times New Roman"/>
-                <w:sz w:val="14"/>
-              </w:rPr>
-            </w:pPr>
+            <w:r>
+              <w:t>{m_gen}</w:t>
+            </w:r>
           </w:p>
         </w:tc>
         <w:tc>
@@ -469,13 +465,9 @@
             <w:tcW w:w="646" w:type="dxa"/>
           </w:tcPr>
           <w:p>
-            <w:pPr>
-              <w:pStyle w:val="TableParagraph"/>
-              <w:rPr>
-                <w:rFonts w:ascii="Times New Roman"/>
-                <w:sz w:val="14"/>
-              </w:rPr>
-            </w:pPr>
+            <w:r>
+              <w:t>{a_gen}</w:t>
+            </w:r>
           </w:p>
         </w:tc>
       </w:tr>

</xml_diff>